<commit_message>
Add Praktikum 3 - PHP Login System with Cookie & Session, Form with REQUEST, and MySQL Database
</commit_message>
<xml_diff>
--- a/LAPORAN PRAKTIKUM 2 - WEb porto.docx
+++ b/LAPORAN PRAKTIKUM 2 - WEb porto.docx
@@ -180,37 +180,7 @@
           <w:lang w:eastAsia="en-ID"/>
           <w14:ligatures w14:val="none"/>
         </w:rPr>
-        <w:t xml:space="preserve">Dosen </w:t>
-      </w:r>
-      <w:proofErr w:type="spellStart"/>
-      <w:r>
-        <w:rPr>
-          <w:rFonts w:ascii="Times New Roman" w:eastAsia="Times New Roman" w:hAnsi="Times New Roman" w:cs="Times New Roman"/>
-          <w:b/>
-          <w:bCs/>
-          <w:color w:val="000000"/>
-          <w:kern w:val="0"/>
-          <w:sz w:val="24"/>
-          <w:szCs w:val="24"/>
-          <w:lang w:eastAsia="en-ID"/>
-          <w14:ligatures w14:val="none"/>
-        </w:rPr>
-        <w:t>Pengampu</w:t>
-      </w:r>
-      <w:proofErr w:type="spellEnd"/>
-      <w:r>
-        <w:rPr>
-          <w:rFonts w:ascii="Times New Roman" w:eastAsia="Times New Roman" w:hAnsi="Times New Roman" w:cs="Times New Roman"/>
-          <w:b/>
-          <w:bCs/>
-          <w:color w:val="000000"/>
-          <w:kern w:val="0"/>
-          <w:sz w:val="24"/>
-          <w:szCs w:val="24"/>
-          <w:lang w:eastAsia="en-ID"/>
-          <w14:ligatures w14:val="none"/>
-        </w:rPr>
-        <w:t>:</w:t>
+        <w:t>Dosen Pengampu:</w:t>
       </w:r>
     </w:p>
     <w:p>
@@ -236,12 +206,16 @@
           <w:lang w:eastAsia="en-ID"/>
           <w14:ligatures w14:val="none"/>
         </w:rPr>
-        <w:t xml:space="preserve">M. Faris Al Hakim, </w:t>
-      </w:r>
-      <w:proofErr w:type="spellStart"/>
-      <w:r>
+        <w:t>M. Faris Al Hakim, S.Pd., M.Cs. </w:t>
+      </w:r>
+    </w:p>
+    <w:p>
+      <w:pPr>
+        <w:spacing w:after="0" w:line="240" w:lineRule="auto"/>
         <w:rPr>
           <w:rFonts w:ascii="Times New Roman" w:eastAsia="Times New Roman" w:hAnsi="Times New Roman" w:cs="Times New Roman"/>
+          <w:b/>
+          <w:bCs/>
           <w:color w:val="000000"/>
           <w:kern w:val="0"/>
           <w:sz w:val="24"/>
@@ -249,12 +223,16 @@
           <w:lang w:eastAsia="en-ID"/>
           <w14:ligatures w14:val="none"/>
         </w:rPr>
-        <w:t>S.Pd</w:t>
-      </w:r>
-      <w:proofErr w:type="spellEnd"/>
-      <w:r>
+      </w:pPr>
+    </w:p>
+    <w:p>
+      <w:pPr>
+        <w:spacing w:after="0" w:line="240" w:lineRule="auto"/>
+        <w:jc w:val="center"/>
         <w:rPr>
           <w:rFonts w:ascii="Times New Roman" w:eastAsia="Times New Roman" w:hAnsi="Times New Roman" w:cs="Times New Roman"/>
+          <w:b/>
+          <w:bCs/>
           <w:color w:val="000000"/>
           <w:kern w:val="0"/>
           <w:sz w:val="24"/>
@@ -262,12 +240,22 @@
           <w:lang w:eastAsia="en-ID"/>
           <w14:ligatures w14:val="none"/>
         </w:rPr>
-        <w:t>., M.Cs. </w:t>
-      </w:r>
+      </w:pPr>
     </w:p>
     <w:p>
       <w:pPr>
         <w:spacing w:after="0" w:line="240" w:lineRule="auto"/>
+        <w:jc w:val="center"/>
+        <w:rPr>
+          <w:rFonts w:ascii="Times New Roman" w:eastAsia="Times New Roman" w:hAnsi="Times New Roman" w:cs="Times New Roman"/>
+          <w:kern w:val="0"/>
+          <w:sz w:val="24"/>
+          <w:szCs w:val="24"/>
+          <w:lang w:eastAsia="en-ID"/>
+          <w14:ligatures w14:val="none"/>
+        </w:rPr>
+      </w:pPr>
+      <w:r>
         <w:rPr>
           <w:rFonts w:ascii="Times New Roman" w:eastAsia="Times New Roman" w:hAnsi="Times New Roman" w:cs="Times New Roman"/>
           <w:b/>
@@ -279,67 +267,7 @@
           <w:lang w:eastAsia="en-ID"/>
           <w14:ligatures w14:val="none"/>
         </w:rPr>
-      </w:pPr>
-    </w:p>
-    <w:p>
-      <w:pPr>
-        <w:spacing w:after="0" w:line="240" w:lineRule="auto"/>
-        <w:jc w:val="center"/>
-        <w:rPr>
-          <w:rFonts w:ascii="Times New Roman" w:eastAsia="Times New Roman" w:hAnsi="Times New Roman" w:cs="Times New Roman"/>
-          <w:b/>
-          <w:bCs/>
-          <w:color w:val="000000"/>
-          <w:kern w:val="0"/>
-          <w:sz w:val="24"/>
-          <w:szCs w:val="24"/>
-          <w:lang w:eastAsia="en-ID"/>
-          <w14:ligatures w14:val="none"/>
-        </w:rPr>
-      </w:pPr>
-    </w:p>
-    <w:p>
-      <w:pPr>
-        <w:spacing w:after="0" w:line="240" w:lineRule="auto"/>
-        <w:jc w:val="center"/>
-        <w:rPr>
-          <w:rFonts w:ascii="Times New Roman" w:eastAsia="Times New Roman" w:hAnsi="Times New Roman" w:cs="Times New Roman"/>
-          <w:kern w:val="0"/>
-          <w:sz w:val="24"/>
-          <w:szCs w:val="24"/>
-          <w:lang w:eastAsia="en-ID"/>
-          <w14:ligatures w14:val="none"/>
-        </w:rPr>
-      </w:pPr>
-      <w:proofErr w:type="spellStart"/>
-      <w:r>
-        <w:rPr>
-          <w:rFonts w:ascii="Times New Roman" w:eastAsia="Times New Roman" w:hAnsi="Times New Roman" w:cs="Times New Roman"/>
-          <w:b/>
-          <w:bCs/>
-          <w:color w:val="000000"/>
-          <w:kern w:val="0"/>
-          <w:sz w:val="24"/>
-          <w:szCs w:val="24"/>
-          <w:lang w:eastAsia="en-ID"/>
-          <w14:ligatures w14:val="none"/>
-        </w:rPr>
-        <w:t>Disusun</w:t>
-      </w:r>
-      <w:proofErr w:type="spellEnd"/>
-      <w:r>
-        <w:rPr>
-          <w:rFonts w:ascii="Times New Roman" w:eastAsia="Times New Roman" w:hAnsi="Times New Roman" w:cs="Times New Roman"/>
-          <w:b/>
-          <w:bCs/>
-          <w:color w:val="000000"/>
-          <w:kern w:val="0"/>
-          <w:sz w:val="24"/>
-          <w:szCs w:val="24"/>
-          <w:lang w:eastAsia="en-ID"/>
-          <w14:ligatures w14:val="none"/>
-        </w:rPr>
-        <w:t xml:space="preserve"> Oleh:</w:t>
+        <w:t>Disusun Oleh:</w:t>
       </w:r>
     </w:p>
     <w:tbl>
@@ -395,22 +323,8 @@
                 <w:lang w:eastAsia="en-ID"/>
                 <w14:ligatures w14:val="none"/>
               </w:rPr>
-              <w:t xml:space="preserve">Haidar Yahya </w:t>
+              <w:t>Haidar Yahya Syarif</w:t>
             </w:r>
-            <w:proofErr w:type="spellStart"/>
-            <w:r>
-              <w:rPr>
-                <w:rFonts w:ascii="Times New Roman" w:eastAsia="Times New Roman" w:hAnsi="Times New Roman" w:cs="Times New Roman"/>
-                <w:color w:val="000000"/>
-                <w:kern w:val="0"/>
-                <w:sz w:val="24"/>
-                <w:szCs w:val="24"/>
-                <w:lang w:eastAsia="en-ID"/>
-                <w14:ligatures w14:val="none"/>
-              </w:rPr>
-              <w:t>Syarif</w:t>
-            </w:r>
-            <w:proofErr w:type="spellEnd"/>
           </w:p>
         </w:tc>
         <w:tc>
@@ -713,7 +627,6 @@
           <w:szCs w:val="24"/>
         </w:rPr>
       </w:pPr>
-      <w:proofErr w:type="spellStart"/>
       <w:r>
         <w:rPr>
           <w:rFonts w:ascii="Times New Roman" w:eastAsia="Calibri" w:hAnsi="Times New Roman" w:cs="Times New Roman"/>
@@ -721,9 +634,16 @@
           <w:szCs w:val="24"/>
         </w:rPr>
         <w:lastRenderedPageBreak/>
-        <w:t>Laporan</w:t>
-      </w:r>
-      <w:proofErr w:type="spellEnd"/>
+        <w:t xml:space="preserve">Laporan ini berisi dokumentasi hasil pengerjaan Praktikum 2 </w:t>
+      </w:r>
+      <w:r>
+        <w:rPr>
+          <w:rFonts w:ascii="Times New Roman" w:eastAsia="Calibri" w:hAnsi="Times New Roman" w:cs="Times New Roman"/>
+          <w:sz w:val="24"/>
+          <w:szCs w:val="24"/>
+        </w:rPr>
+        <w:t>–</w:t>
+      </w:r>
       <w:r>
         <w:rPr>
           <w:rFonts w:ascii="Times New Roman" w:eastAsia="Calibri" w:hAnsi="Times New Roman" w:cs="Times New Roman"/>
@@ -732,274 +652,22 @@
         </w:rPr>
         <w:t xml:space="preserve"> </w:t>
       </w:r>
-      <w:proofErr w:type="spellStart"/>
-      <w:r>
-        <w:rPr>
-          <w:rFonts w:ascii="Times New Roman" w:eastAsia="Calibri" w:hAnsi="Times New Roman" w:cs="Times New Roman"/>
-          <w:sz w:val="24"/>
-          <w:szCs w:val="24"/>
-        </w:rPr>
-        <w:t>ini</w:t>
-      </w:r>
-      <w:proofErr w:type="spellEnd"/>
-      <w:r>
-        <w:rPr>
-          <w:rFonts w:ascii="Times New Roman" w:eastAsia="Calibri" w:hAnsi="Times New Roman" w:cs="Times New Roman"/>
-          <w:sz w:val="24"/>
-          <w:szCs w:val="24"/>
-        </w:rPr>
-        <w:t xml:space="preserve"> </w:t>
-      </w:r>
-      <w:proofErr w:type="spellStart"/>
-      <w:r>
-        <w:rPr>
-          <w:rFonts w:ascii="Times New Roman" w:eastAsia="Calibri" w:hAnsi="Times New Roman" w:cs="Times New Roman"/>
-          <w:sz w:val="24"/>
-          <w:szCs w:val="24"/>
-        </w:rPr>
-        <w:t>berisi</w:t>
-      </w:r>
-      <w:proofErr w:type="spellEnd"/>
-      <w:r>
-        <w:rPr>
-          <w:rFonts w:ascii="Times New Roman" w:eastAsia="Calibri" w:hAnsi="Times New Roman" w:cs="Times New Roman"/>
-          <w:sz w:val="24"/>
-          <w:szCs w:val="24"/>
-        </w:rPr>
-        <w:t xml:space="preserve"> </w:t>
-      </w:r>
-      <w:proofErr w:type="spellStart"/>
-      <w:r>
-        <w:rPr>
-          <w:rFonts w:ascii="Times New Roman" w:eastAsia="Calibri" w:hAnsi="Times New Roman" w:cs="Times New Roman"/>
-          <w:sz w:val="24"/>
-          <w:szCs w:val="24"/>
-        </w:rPr>
-        <w:t>dokumentasi</w:t>
-      </w:r>
-      <w:proofErr w:type="spellEnd"/>
-      <w:r>
-        <w:rPr>
-          <w:rFonts w:ascii="Times New Roman" w:eastAsia="Calibri" w:hAnsi="Times New Roman" w:cs="Times New Roman"/>
-          <w:sz w:val="24"/>
-          <w:szCs w:val="24"/>
-        </w:rPr>
-        <w:t xml:space="preserve"> </w:t>
-      </w:r>
-      <w:proofErr w:type="spellStart"/>
-      <w:r>
-        <w:rPr>
-          <w:rFonts w:ascii="Times New Roman" w:eastAsia="Calibri" w:hAnsi="Times New Roman" w:cs="Times New Roman"/>
-          <w:sz w:val="24"/>
-          <w:szCs w:val="24"/>
-        </w:rPr>
-        <w:t>hasil</w:t>
-      </w:r>
-      <w:proofErr w:type="spellEnd"/>
-      <w:r>
-        <w:rPr>
-          <w:rFonts w:ascii="Times New Roman" w:eastAsia="Calibri" w:hAnsi="Times New Roman" w:cs="Times New Roman"/>
-          <w:sz w:val="24"/>
-          <w:szCs w:val="24"/>
-        </w:rPr>
-        <w:t xml:space="preserve"> </w:t>
-      </w:r>
-      <w:proofErr w:type="spellStart"/>
-      <w:r>
-        <w:rPr>
-          <w:rFonts w:ascii="Times New Roman" w:eastAsia="Calibri" w:hAnsi="Times New Roman" w:cs="Times New Roman"/>
-          <w:sz w:val="24"/>
-          <w:szCs w:val="24"/>
-        </w:rPr>
-        <w:t>pengerjaan</w:t>
-      </w:r>
-      <w:proofErr w:type="spellEnd"/>
-      <w:r>
-        <w:rPr>
-          <w:rFonts w:ascii="Times New Roman" w:eastAsia="Calibri" w:hAnsi="Times New Roman" w:cs="Times New Roman"/>
-          <w:sz w:val="24"/>
-          <w:szCs w:val="24"/>
-        </w:rPr>
-        <w:t xml:space="preserve"> </w:t>
-      </w:r>
-      <w:proofErr w:type="spellStart"/>
-      <w:r>
-        <w:rPr>
-          <w:rFonts w:ascii="Times New Roman" w:eastAsia="Calibri" w:hAnsi="Times New Roman" w:cs="Times New Roman"/>
-          <w:sz w:val="24"/>
-          <w:szCs w:val="24"/>
-        </w:rPr>
-        <w:t>Praktikum</w:t>
-      </w:r>
-      <w:proofErr w:type="spellEnd"/>
-      <w:r>
-        <w:rPr>
-          <w:rFonts w:ascii="Times New Roman" w:eastAsia="Calibri" w:hAnsi="Times New Roman" w:cs="Times New Roman"/>
-          <w:sz w:val="24"/>
-          <w:szCs w:val="24"/>
-        </w:rPr>
-        <w:t xml:space="preserve"> 2 </w:t>
-      </w:r>
-      <w:r>
-        <w:rPr>
-          <w:rFonts w:ascii="Times New Roman" w:eastAsia="Calibri" w:hAnsi="Times New Roman" w:cs="Times New Roman"/>
-          <w:sz w:val="24"/>
-          <w:szCs w:val="24"/>
-        </w:rPr>
-        <w:t>–</w:t>
-      </w:r>
-      <w:r>
-        <w:rPr>
-          <w:rFonts w:ascii="Times New Roman" w:eastAsia="Calibri" w:hAnsi="Times New Roman" w:cs="Times New Roman"/>
-          <w:sz w:val="24"/>
-          <w:szCs w:val="24"/>
-        </w:rPr>
-        <w:t xml:space="preserve"> </w:t>
-      </w:r>
-      <w:proofErr w:type="spellStart"/>
-      <w:r>
-        <w:rPr>
-          <w:rFonts w:ascii="Times New Roman" w:eastAsia="Calibri" w:hAnsi="Times New Roman" w:cs="Times New Roman"/>
-          <w:sz w:val="24"/>
-          <w:szCs w:val="24"/>
-        </w:rPr>
-        <w:t>Membuat</w:t>
-      </w:r>
-      <w:proofErr w:type="spellEnd"/>
-      <w:r>
-        <w:rPr>
-          <w:rFonts w:ascii="Times New Roman" w:eastAsia="Calibri" w:hAnsi="Times New Roman" w:cs="Times New Roman"/>
-          <w:sz w:val="24"/>
-          <w:szCs w:val="24"/>
-        </w:rPr>
-        <w:t xml:space="preserve"> Website </w:t>
-      </w:r>
-      <w:proofErr w:type="spellStart"/>
-      <w:r>
-        <w:rPr>
-          <w:rFonts w:ascii="Times New Roman" w:eastAsia="Calibri" w:hAnsi="Times New Roman" w:cs="Times New Roman"/>
-          <w:sz w:val="24"/>
-          <w:szCs w:val="24"/>
-        </w:rPr>
-        <w:t>Portofolio</w:t>
-      </w:r>
-      <w:proofErr w:type="spellEnd"/>
-      <w:r>
-        <w:rPr>
-          <w:rFonts w:ascii="Times New Roman" w:eastAsia="Calibri" w:hAnsi="Times New Roman" w:cs="Times New Roman"/>
-          <w:sz w:val="24"/>
-          <w:szCs w:val="24"/>
-        </w:rPr>
-        <w:t xml:space="preserve"> </w:t>
-      </w:r>
-      <w:proofErr w:type="spellStart"/>
-      <w:r>
-        <w:rPr>
-          <w:rFonts w:ascii="Times New Roman" w:eastAsia="Calibri" w:hAnsi="Times New Roman" w:cs="Times New Roman"/>
-          <w:sz w:val="24"/>
-          <w:szCs w:val="24"/>
-        </w:rPr>
-        <w:t>menggunakan</w:t>
-      </w:r>
-      <w:proofErr w:type="spellEnd"/>
-      <w:r>
-        <w:rPr>
-          <w:rFonts w:ascii="Times New Roman" w:eastAsia="Calibri" w:hAnsi="Times New Roman" w:cs="Times New Roman"/>
-          <w:sz w:val="24"/>
-          <w:szCs w:val="24"/>
-        </w:rPr>
-        <w:t xml:space="preserve"> HTML dan CSS</w:t>
-      </w:r>
-      <w:r>
-        <w:rPr>
-          <w:rFonts w:ascii="Times New Roman" w:eastAsia="Calibri" w:hAnsi="Times New Roman" w:cs="Times New Roman"/>
-          <w:sz w:val="24"/>
-          <w:szCs w:val="24"/>
-        </w:rPr>
-        <w:t xml:space="preserve">, </w:t>
-      </w:r>
-      <w:proofErr w:type="spellStart"/>
-      <w:r>
-        <w:rPr>
-          <w:rFonts w:ascii="Times New Roman" w:eastAsia="Calibri" w:hAnsi="Times New Roman" w:cs="Times New Roman"/>
-          <w:sz w:val="24"/>
-          <w:szCs w:val="24"/>
-        </w:rPr>
-        <w:t>berupa</w:t>
-      </w:r>
-      <w:proofErr w:type="spellEnd"/>
-      <w:r>
-        <w:rPr>
-          <w:rFonts w:ascii="Times New Roman" w:eastAsia="Calibri" w:hAnsi="Times New Roman" w:cs="Times New Roman"/>
-          <w:sz w:val="24"/>
-          <w:szCs w:val="24"/>
-        </w:rPr>
-        <w:t xml:space="preserve"> screenshot </w:t>
-      </w:r>
-      <w:proofErr w:type="spellStart"/>
-      <w:r>
-        <w:rPr>
-          <w:rFonts w:ascii="Times New Roman" w:eastAsia="Calibri" w:hAnsi="Times New Roman" w:cs="Times New Roman"/>
-          <w:sz w:val="24"/>
-          <w:szCs w:val="24"/>
-        </w:rPr>
-        <w:t>tiap</w:t>
-      </w:r>
-      <w:proofErr w:type="spellEnd"/>
-      <w:r>
-        <w:rPr>
-          <w:rFonts w:ascii="Times New Roman" w:eastAsia="Calibri" w:hAnsi="Times New Roman" w:cs="Times New Roman"/>
-          <w:sz w:val="24"/>
-          <w:szCs w:val="24"/>
-        </w:rPr>
-        <w:t xml:space="preserve"> </w:t>
-      </w:r>
-      <w:proofErr w:type="spellStart"/>
-      <w:r>
-        <w:rPr>
-          <w:rFonts w:ascii="Times New Roman" w:eastAsia="Calibri" w:hAnsi="Times New Roman" w:cs="Times New Roman"/>
-          <w:sz w:val="24"/>
-          <w:szCs w:val="24"/>
-        </w:rPr>
-        <w:t>halaman</w:t>
-      </w:r>
-      <w:proofErr w:type="spellEnd"/>
-      <w:r>
-        <w:rPr>
-          <w:rFonts w:ascii="Times New Roman" w:eastAsia="Calibri" w:hAnsi="Times New Roman" w:cs="Times New Roman"/>
-          <w:sz w:val="24"/>
-          <w:szCs w:val="24"/>
-        </w:rPr>
-        <w:t xml:space="preserve"> yang </w:t>
-      </w:r>
-      <w:proofErr w:type="spellStart"/>
-      <w:r>
-        <w:rPr>
-          <w:rFonts w:ascii="Times New Roman" w:eastAsia="Calibri" w:hAnsi="Times New Roman" w:cs="Times New Roman"/>
-          <w:sz w:val="24"/>
-          <w:szCs w:val="24"/>
-        </w:rPr>
-        <w:t>telah</w:t>
-      </w:r>
-      <w:proofErr w:type="spellEnd"/>
-      <w:r>
-        <w:rPr>
-          <w:rFonts w:ascii="Times New Roman" w:eastAsia="Calibri" w:hAnsi="Times New Roman" w:cs="Times New Roman"/>
-          <w:sz w:val="24"/>
-          <w:szCs w:val="24"/>
-        </w:rPr>
-        <w:t xml:space="preserve"> </w:t>
-      </w:r>
-      <w:proofErr w:type="spellStart"/>
-      <w:r>
-        <w:rPr>
-          <w:rFonts w:ascii="Times New Roman" w:eastAsia="Calibri" w:hAnsi="Times New Roman" w:cs="Times New Roman"/>
-          <w:sz w:val="24"/>
-          <w:szCs w:val="24"/>
-        </w:rPr>
-        <w:t>dibuat</w:t>
-      </w:r>
-      <w:proofErr w:type="spellEnd"/>
+      <w:r>
+        <w:rPr>
+          <w:rFonts w:ascii="Times New Roman" w:eastAsia="Calibri" w:hAnsi="Times New Roman" w:cs="Times New Roman"/>
+          <w:sz w:val="24"/>
+          <w:szCs w:val="24"/>
+        </w:rPr>
+        <w:t>Membuat Website Portofolio menggunakan HTML dan CSS</w:t>
+      </w:r>
+      <w:r>
+        <w:rPr>
+          <w:rFonts w:ascii="Times New Roman" w:eastAsia="Calibri" w:hAnsi="Times New Roman" w:cs="Times New Roman"/>
+          <w:sz w:val="24"/>
+          <w:szCs w:val="24"/>
+        </w:rPr>
+        <w:t>, berupa screenshot tiap halaman yang telah dibuat</w:t>
+      </w:r>
     </w:p>
     <w:p>
       <w:pPr>
@@ -1411,10 +1079,10 @@
           <w:rFonts w:ascii="Times New Roman" w:hAnsi="Times New Roman" w:cs="Times New Roman"/>
         </w:rPr>
         <w:drawing>
-          <wp:inline distT="0" distB="0" distL="0" distR="0" wp14:anchorId="0FE50844" wp14:editId="1312D526">
-            <wp:extent cx="5731510" cy="2900045"/>
+          <wp:inline distT="0" distB="0" distL="0" distR="0" wp14:anchorId="36A79542" wp14:editId="12DA9378">
+            <wp:extent cx="5731510" cy="2898775"/>
             <wp:effectExtent l="0" t="0" r="2540" b="0"/>
-            <wp:docPr id="854857956" name="Picture 1" descr="A screenshot of a computer&#10;&#10;AI-generated content may be incorrect."/>
+            <wp:docPr id="156111416" name="Picture 1" descr="A screenshot of a computer&#10;&#10;AI-generated content may be incorrect."/>
             <wp:cNvGraphicFramePr>
               <a:graphicFrameLocks xmlns:a="http://schemas.openxmlformats.org/drawingml/2006/main" noChangeAspect="1"/>
             </wp:cNvGraphicFramePr>
@@ -1422,7 +1090,7 @@
               <a:graphicData uri="http://schemas.openxmlformats.org/drawingml/2006/picture">
                 <pic:pic xmlns:pic="http://schemas.openxmlformats.org/drawingml/2006/picture">
                   <pic:nvPicPr>
-                    <pic:cNvPr id="854857956" name="Picture 1" descr="A screenshot of a computer&#10;&#10;AI-generated content may be incorrect."/>
+                    <pic:cNvPr id="156111416" name="Picture 1" descr="A screenshot of a computer&#10;&#10;AI-generated content may be incorrect."/>
                     <pic:cNvPicPr/>
                   </pic:nvPicPr>
                   <pic:blipFill>
@@ -1434,7 +1102,7 @@
                   <pic:spPr>
                     <a:xfrm>
                       <a:off x="0" y="0"/>
-                      <a:ext cx="5731510" cy="2900045"/>
+                      <a:ext cx="5731510" cy="2898775"/>
                     </a:xfrm>
                     <a:prstGeom prst="rect">
                       <a:avLst/>
@@ -1724,7 +1392,6 @@
         <w:lastRenderedPageBreak/>
         <w:t xml:space="preserve">2. </w:t>
       </w:r>
-      <w:proofErr w:type="spellStart"/>
       <w:r>
         <w:rPr>
           <w:rFonts w:ascii="Times New Roman" w:eastAsia="Calibri" w:hAnsi="Times New Roman" w:cs="Times New Roman"/>
@@ -1734,33 +1401,8 @@
           <w:szCs w:val="28"/>
           <w:lang w:val="en-US"/>
         </w:rPr>
-        <w:t>Poin-Poin</w:t>
-      </w:r>
-      <w:proofErr w:type="spellEnd"/>
-      <w:r>
-        <w:rPr>
-          <w:rFonts w:ascii="Times New Roman" w:eastAsia="Calibri" w:hAnsi="Times New Roman" w:cs="Times New Roman"/>
-          <w:b/>
-          <w:bCs/>
-          <w:sz w:val="28"/>
-          <w:szCs w:val="28"/>
-          <w:lang w:val="en-US"/>
-        </w:rPr>
-        <w:t xml:space="preserve"> Utama </w:t>
-      </w:r>
-      <w:proofErr w:type="spellStart"/>
-      <w:r>
-        <w:rPr>
-          <w:rFonts w:ascii="Times New Roman" w:eastAsia="Calibri" w:hAnsi="Times New Roman" w:cs="Times New Roman"/>
-          <w:b/>
-          <w:bCs/>
-          <w:sz w:val="28"/>
-          <w:szCs w:val="28"/>
-          <w:lang w:val="en-US"/>
-        </w:rPr>
-        <w:t>Pembahasan</w:t>
-      </w:r>
-      <w:proofErr w:type="spellEnd"/>
+        <w:t>Poin-Poin Utama Pembahasan</w:t>
+      </w:r>
     </w:p>
     <w:p>
       <w:pPr>
@@ -1776,7 +1418,6 @@
           <w:lang w:val="en-US"/>
         </w:rPr>
       </w:pPr>
-      <w:proofErr w:type="spellStart"/>
       <w:r>
         <w:rPr>
           <w:rFonts w:ascii="Times New Roman" w:eastAsia="Calibri" w:hAnsi="Times New Roman" w:cs="Times New Roman"/>
@@ -1784,157 +1425,7 @@
           <w:szCs w:val="24"/>
           <w:lang w:val="en-US"/>
         </w:rPr>
-        <w:t>Struktur</w:t>
-      </w:r>
-      <w:proofErr w:type="spellEnd"/>
-      <w:r>
-        <w:rPr>
-          <w:rFonts w:ascii="Times New Roman" w:eastAsia="Calibri" w:hAnsi="Times New Roman" w:cs="Times New Roman"/>
-          <w:sz w:val="24"/>
-          <w:szCs w:val="24"/>
-          <w:lang w:val="en-US"/>
-        </w:rPr>
-        <w:t xml:space="preserve"> HTML: </w:t>
-      </w:r>
-      <w:proofErr w:type="spellStart"/>
-      <w:r>
-        <w:rPr>
-          <w:rFonts w:ascii="Times New Roman" w:eastAsia="Calibri" w:hAnsi="Times New Roman" w:cs="Times New Roman"/>
-          <w:sz w:val="24"/>
-          <w:szCs w:val="24"/>
-          <w:lang w:val="en-US"/>
-        </w:rPr>
-        <w:t>Menggunakan</w:t>
-      </w:r>
-      <w:proofErr w:type="spellEnd"/>
-      <w:r>
-        <w:rPr>
-          <w:rFonts w:ascii="Times New Roman" w:eastAsia="Calibri" w:hAnsi="Times New Roman" w:cs="Times New Roman"/>
-          <w:sz w:val="24"/>
-          <w:szCs w:val="24"/>
-          <w:lang w:val="en-US"/>
-        </w:rPr>
-        <w:t xml:space="preserve"> </w:t>
-      </w:r>
-      <w:proofErr w:type="spellStart"/>
-      <w:r>
-        <w:rPr>
-          <w:rFonts w:ascii="Times New Roman" w:eastAsia="Calibri" w:hAnsi="Times New Roman" w:cs="Times New Roman"/>
-          <w:sz w:val="24"/>
-          <w:szCs w:val="24"/>
-          <w:lang w:val="en-US"/>
-        </w:rPr>
-        <w:t>elemen</w:t>
-      </w:r>
-      <w:proofErr w:type="spellEnd"/>
-      <w:r>
-        <w:rPr>
-          <w:rFonts w:ascii="Times New Roman" w:eastAsia="Calibri" w:hAnsi="Times New Roman" w:cs="Times New Roman"/>
-          <w:sz w:val="24"/>
-          <w:szCs w:val="24"/>
-          <w:lang w:val="en-US"/>
-        </w:rPr>
-        <w:t xml:space="preserve"> </w:t>
-      </w:r>
-      <w:proofErr w:type="spellStart"/>
-      <w:r>
-        <w:rPr>
-          <w:rFonts w:ascii="Times New Roman" w:eastAsia="Calibri" w:hAnsi="Times New Roman" w:cs="Times New Roman"/>
-          <w:sz w:val="24"/>
-          <w:szCs w:val="24"/>
-          <w:lang w:val="en-US"/>
-        </w:rPr>
-        <w:t>semantik</w:t>
-      </w:r>
-      <w:proofErr w:type="spellEnd"/>
-      <w:r>
-        <w:rPr>
-          <w:rFonts w:ascii="Times New Roman" w:eastAsia="Calibri" w:hAnsi="Times New Roman" w:cs="Times New Roman"/>
-          <w:sz w:val="24"/>
-          <w:szCs w:val="24"/>
-          <w:lang w:val="en-US"/>
-        </w:rPr>
-        <w:t xml:space="preserve"> (&lt;header&gt;, &lt;nav&gt;, &lt;aside&gt;, &lt;main&gt;, &lt;footer&gt;) </w:t>
-      </w:r>
-      <w:proofErr w:type="spellStart"/>
-      <w:r>
-        <w:rPr>
-          <w:rFonts w:ascii="Times New Roman" w:eastAsia="Calibri" w:hAnsi="Times New Roman" w:cs="Times New Roman"/>
-          <w:sz w:val="24"/>
-          <w:szCs w:val="24"/>
-          <w:lang w:val="en-US"/>
-        </w:rPr>
-        <w:t>untuk</w:t>
-      </w:r>
-      <w:proofErr w:type="spellEnd"/>
-      <w:r>
-        <w:rPr>
-          <w:rFonts w:ascii="Times New Roman" w:eastAsia="Calibri" w:hAnsi="Times New Roman" w:cs="Times New Roman"/>
-          <w:sz w:val="24"/>
-          <w:szCs w:val="24"/>
-          <w:lang w:val="en-US"/>
-        </w:rPr>
-        <w:t xml:space="preserve"> </w:t>
-      </w:r>
-      <w:proofErr w:type="spellStart"/>
-      <w:r>
-        <w:rPr>
-          <w:rFonts w:ascii="Times New Roman" w:eastAsia="Calibri" w:hAnsi="Times New Roman" w:cs="Times New Roman"/>
-          <w:sz w:val="24"/>
-          <w:szCs w:val="24"/>
-          <w:lang w:val="en-US"/>
-        </w:rPr>
-        <w:t>struktur</w:t>
-      </w:r>
-      <w:proofErr w:type="spellEnd"/>
-      <w:r>
-        <w:rPr>
-          <w:rFonts w:ascii="Times New Roman" w:eastAsia="Calibri" w:hAnsi="Times New Roman" w:cs="Times New Roman"/>
-          <w:sz w:val="24"/>
-          <w:szCs w:val="24"/>
-          <w:lang w:val="en-US"/>
-        </w:rPr>
-        <w:t xml:space="preserve"> SEO-friendly dan </w:t>
-      </w:r>
-      <w:proofErr w:type="spellStart"/>
-      <w:r>
-        <w:rPr>
-          <w:rFonts w:ascii="Times New Roman" w:eastAsia="Calibri" w:hAnsi="Times New Roman" w:cs="Times New Roman"/>
-          <w:sz w:val="24"/>
-          <w:szCs w:val="24"/>
-          <w:lang w:val="en-US"/>
-        </w:rPr>
-        <w:t>ramah</w:t>
-      </w:r>
-      <w:proofErr w:type="spellEnd"/>
-      <w:r>
-        <w:rPr>
-          <w:rFonts w:ascii="Times New Roman" w:eastAsia="Calibri" w:hAnsi="Times New Roman" w:cs="Times New Roman"/>
-          <w:sz w:val="24"/>
-          <w:szCs w:val="24"/>
-          <w:lang w:val="en-US"/>
-        </w:rPr>
-        <w:t xml:space="preserve"> </w:t>
-      </w:r>
-      <w:proofErr w:type="spellStart"/>
-      <w:r>
-        <w:rPr>
-          <w:rFonts w:ascii="Times New Roman" w:eastAsia="Calibri" w:hAnsi="Times New Roman" w:cs="Times New Roman"/>
-          <w:sz w:val="24"/>
-          <w:szCs w:val="24"/>
-          <w:lang w:val="en-US"/>
-        </w:rPr>
-        <w:t>aksesibilitas</w:t>
-      </w:r>
-      <w:proofErr w:type="spellEnd"/>
-      <w:r>
-        <w:rPr>
-          <w:rFonts w:ascii="Times New Roman" w:eastAsia="Calibri" w:hAnsi="Times New Roman" w:cs="Times New Roman"/>
-          <w:sz w:val="24"/>
-          <w:szCs w:val="24"/>
-          <w:lang w:val="en-US"/>
-        </w:rPr>
-        <w:t>.</w:t>
+        <w:t>Struktur HTML: Menggunakan elemen semantik (&lt;header&gt;, &lt;nav&gt;, &lt;aside&gt;, &lt;main&gt;, &lt;footer&gt;) untuk struktur SEO-friendly dan ramah aksesibilitas.</w:t>
       </w:r>
     </w:p>
     <w:p>
@@ -1951,7 +1442,6 @@
           <w:lang w:val="en-US"/>
         </w:rPr>
       </w:pPr>
-      <w:proofErr w:type="spellStart"/>
       <w:r>
         <w:rPr>
           <w:rFonts w:ascii="Times New Roman" w:eastAsia="Calibri" w:hAnsi="Times New Roman" w:cs="Times New Roman"/>
@@ -1959,117 +1449,7 @@
           <w:szCs w:val="24"/>
           <w:lang w:val="en-US"/>
         </w:rPr>
-        <w:t>Implementasi</w:t>
-      </w:r>
-      <w:proofErr w:type="spellEnd"/>
-      <w:r>
-        <w:rPr>
-          <w:rFonts w:ascii="Times New Roman" w:eastAsia="Calibri" w:hAnsi="Times New Roman" w:cs="Times New Roman"/>
-          <w:sz w:val="24"/>
-          <w:szCs w:val="24"/>
-          <w:lang w:val="en-US"/>
-        </w:rPr>
-        <w:t xml:space="preserve"> CSS: </w:t>
-      </w:r>
-      <w:proofErr w:type="spellStart"/>
-      <w:r>
-        <w:rPr>
-          <w:rFonts w:ascii="Times New Roman" w:eastAsia="Calibri" w:hAnsi="Times New Roman" w:cs="Times New Roman"/>
-          <w:sz w:val="24"/>
-          <w:szCs w:val="24"/>
-          <w:lang w:val="en-US"/>
-        </w:rPr>
-        <w:t>Memanfaatkan</w:t>
-      </w:r>
-      <w:proofErr w:type="spellEnd"/>
-      <w:r>
-        <w:rPr>
-          <w:rFonts w:ascii="Times New Roman" w:eastAsia="Calibri" w:hAnsi="Times New Roman" w:cs="Times New Roman"/>
-          <w:sz w:val="24"/>
-          <w:szCs w:val="24"/>
-          <w:lang w:val="en-US"/>
-        </w:rPr>
-        <w:t xml:space="preserve"> CSS Variables </w:t>
-      </w:r>
-      <w:proofErr w:type="gramStart"/>
-      <w:r>
-        <w:rPr>
-          <w:rFonts w:ascii="Times New Roman" w:eastAsia="Calibri" w:hAnsi="Times New Roman" w:cs="Times New Roman"/>
-          <w:sz w:val="24"/>
-          <w:szCs w:val="24"/>
-          <w:lang w:val="en-US"/>
-        </w:rPr>
-        <w:t>(:root</w:t>
-      </w:r>
-      <w:proofErr w:type="gramEnd"/>
-      <w:r>
-        <w:rPr>
-          <w:rFonts w:ascii="Times New Roman" w:eastAsia="Calibri" w:hAnsi="Times New Roman" w:cs="Times New Roman"/>
-          <w:sz w:val="24"/>
-          <w:szCs w:val="24"/>
-          <w:lang w:val="en-US"/>
-        </w:rPr>
-        <w:t xml:space="preserve">), Flexbox, CSS Grid, Box Model, </w:t>
-      </w:r>
-      <w:proofErr w:type="spellStart"/>
-      <w:r>
-        <w:rPr>
-          <w:rFonts w:ascii="Times New Roman" w:eastAsia="Calibri" w:hAnsi="Times New Roman" w:cs="Times New Roman"/>
-          <w:sz w:val="24"/>
-          <w:szCs w:val="24"/>
-          <w:lang w:val="en-US"/>
-        </w:rPr>
-        <w:t>serta</w:t>
-      </w:r>
-      <w:proofErr w:type="spellEnd"/>
-      <w:r>
-        <w:rPr>
-          <w:rFonts w:ascii="Times New Roman" w:eastAsia="Calibri" w:hAnsi="Times New Roman" w:cs="Times New Roman"/>
-          <w:sz w:val="24"/>
-          <w:szCs w:val="24"/>
-          <w:lang w:val="en-US"/>
-        </w:rPr>
-        <w:t xml:space="preserve"> </w:t>
-      </w:r>
-      <w:proofErr w:type="spellStart"/>
-      <w:r>
-        <w:rPr>
-          <w:rFonts w:ascii="Times New Roman" w:eastAsia="Calibri" w:hAnsi="Times New Roman" w:cs="Times New Roman"/>
-          <w:sz w:val="24"/>
-          <w:szCs w:val="24"/>
-          <w:lang w:val="en-US"/>
-        </w:rPr>
-        <w:t>kombinasi</w:t>
-      </w:r>
-      <w:proofErr w:type="spellEnd"/>
-      <w:r>
-        <w:rPr>
-          <w:rFonts w:ascii="Times New Roman" w:eastAsia="Calibri" w:hAnsi="Times New Roman" w:cs="Times New Roman"/>
-          <w:sz w:val="24"/>
-          <w:szCs w:val="24"/>
-          <w:lang w:val="en-US"/>
-        </w:rPr>
-        <w:t xml:space="preserve"> </w:t>
-      </w:r>
-      <w:proofErr w:type="spellStart"/>
-      <w:r>
-        <w:rPr>
-          <w:rFonts w:ascii="Times New Roman" w:eastAsia="Calibri" w:hAnsi="Times New Roman" w:cs="Times New Roman"/>
-          <w:sz w:val="24"/>
-          <w:szCs w:val="24"/>
-          <w:lang w:val="en-US"/>
-        </w:rPr>
-        <w:t>warna</w:t>
-      </w:r>
-      <w:proofErr w:type="spellEnd"/>
-      <w:r>
-        <w:rPr>
-          <w:rFonts w:ascii="Times New Roman" w:eastAsia="Calibri" w:hAnsi="Times New Roman" w:cs="Times New Roman"/>
-          <w:sz w:val="24"/>
-          <w:szCs w:val="24"/>
-          <w:lang w:val="en-US"/>
-        </w:rPr>
-        <w:t xml:space="preserve"> gradient &amp; shadow. </w:t>
+        <w:t xml:space="preserve">Implementasi CSS: Memanfaatkan CSS Variables (:root), Flexbox, CSS Grid, Box Model, serta kombinasi warna gradient &amp; shadow. </w:t>
       </w:r>
     </w:p>
     <w:p>
@@ -2086,7 +1466,6 @@
           <w:lang w:val="en-US"/>
         </w:rPr>
       </w:pPr>
-      <w:proofErr w:type="spellStart"/>
       <w:r>
         <w:rPr>
           <w:rFonts w:ascii="Times New Roman" w:eastAsia="Calibri" w:hAnsi="Times New Roman" w:cs="Times New Roman"/>
@@ -2094,37 +1473,7 @@
           <w:szCs w:val="24"/>
           <w:lang w:val="en-US"/>
         </w:rPr>
-        <w:t>Interaktivitas</w:t>
-      </w:r>
-      <w:proofErr w:type="spellEnd"/>
-      <w:r>
-        <w:rPr>
-          <w:rFonts w:ascii="Times New Roman" w:eastAsia="Calibri" w:hAnsi="Times New Roman" w:cs="Times New Roman"/>
-          <w:sz w:val="24"/>
-          <w:szCs w:val="24"/>
-          <w:lang w:val="en-US"/>
-        </w:rPr>
-        <w:t xml:space="preserve"> JavaScript: </w:t>
-      </w:r>
-      <w:proofErr w:type="spellStart"/>
-      <w:r>
-        <w:rPr>
-          <w:rFonts w:ascii="Times New Roman" w:eastAsia="Calibri" w:hAnsi="Times New Roman" w:cs="Times New Roman"/>
-          <w:sz w:val="24"/>
-          <w:szCs w:val="24"/>
-          <w:lang w:val="en-US"/>
-        </w:rPr>
-        <w:t>Menambahkan</w:t>
-      </w:r>
-      <w:proofErr w:type="spellEnd"/>
-      <w:r>
-        <w:rPr>
-          <w:rFonts w:ascii="Times New Roman" w:eastAsia="Calibri" w:hAnsi="Times New Roman" w:cs="Times New Roman"/>
-          <w:sz w:val="24"/>
-          <w:szCs w:val="24"/>
-          <w:lang w:val="en-US"/>
-        </w:rPr>
-        <w:t xml:space="preserve"> </w:t>
+        <w:t xml:space="preserve">Responsive Design: Menerapkan pendekatan </w:t>
       </w:r>
       <w:r>
         <w:rPr>
@@ -2135,7 +1484,7 @@
           <w:szCs w:val="24"/>
           <w:lang w:val="en-US"/>
         </w:rPr>
-        <w:t>smooth scrolling</w:t>
+        <w:t>mobile-first</w:t>
       </w:r>
       <w:r>
         <w:rPr>
@@ -2144,67 +1493,7 @@
           <w:szCs w:val="24"/>
           <w:lang w:val="en-US"/>
         </w:rPr>
-        <w:t xml:space="preserve">, </w:t>
-      </w:r>
-      <w:proofErr w:type="spellStart"/>
-      <w:r>
-        <w:rPr>
-          <w:rFonts w:ascii="Times New Roman" w:eastAsia="Calibri" w:hAnsi="Times New Roman" w:cs="Times New Roman"/>
-          <w:sz w:val="24"/>
-          <w:szCs w:val="24"/>
-          <w:lang w:val="en-US"/>
-        </w:rPr>
-        <w:t>penanda</w:t>
-      </w:r>
-      <w:proofErr w:type="spellEnd"/>
-      <w:r>
-        <w:rPr>
-          <w:rFonts w:ascii="Times New Roman" w:eastAsia="Calibri" w:hAnsi="Times New Roman" w:cs="Times New Roman"/>
-          <w:sz w:val="24"/>
-          <w:szCs w:val="24"/>
-          <w:lang w:val="en-US"/>
-        </w:rPr>
-        <w:t xml:space="preserve"> menu </w:t>
-      </w:r>
-      <w:proofErr w:type="spellStart"/>
-      <w:r>
-        <w:rPr>
-          <w:rFonts w:ascii="Times New Roman" w:eastAsia="Calibri" w:hAnsi="Times New Roman" w:cs="Times New Roman"/>
-          <w:sz w:val="24"/>
-          <w:szCs w:val="24"/>
-          <w:lang w:val="en-US"/>
-        </w:rPr>
-        <w:t>aktif</w:t>
-      </w:r>
-      <w:proofErr w:type="spellEnd"/>
-      <w:r>
-        <w:rPr>
-          <w:rFonts w:ascii="Times New Roman" w:eastAsia="Calibri" w:hAnsi="Times New Roman" w:cs="Times New Roman"/>
-          <w:sz w:val="24"/>
-          <w:szCs w:val="24"/>
-          <w:lang w:val="en-US"/>
-        </w:rPr>
-        <w:t xml:space="preserve"> </w:t>
-      </w:r>
-      <w:proofErr w:type="spellStart"/>
-      <w:r>
-        <w:rPr>
-          <w:rFonts w:ascii="Times New Roman" w:eastAsia="Calibri" w:hAnsi="Times New Roman" w:cs="Times New Roman"/>
-          <w:sz w:val="24"/>
-          <w:szCs w:val="24"/>
-          <w:lang w:val="en-US"/>
-        </w:rPr>
-        <w:t>saat</w:t>
-      </w:r>
-      <w:proofErr w:type="spellEnd"/>
-      <w:r>
-        <w:rPr>
-          <w:rFonts w:ascii="Times New Roman" w:eastAsia="Calibri" w:hAnsi="Times New Roman" w:cs="Times New Roman"/>
-          <w:sz w:val="24"/>
-          <w:szCs w:val="24"/>
-          <w:lang w:val="en-US"/>
-        </w:rPr>
-        <w:t xml:space="preserve"> di-scroll (</w:t>
+        <w:t xml:space="preserve"> menggunakan </w:t>
       </w:r>
       <w:r>
         <w:rPr>
@@ -2215,7 +1504,7 @@
           <w:szCs w:val="24"/>
           <w:lang w:val="en-US"/>
         </w:rPr>
-        <w:t>active navigation tracking</w:t>
+        <w:t>media queries</w:t>
       </w:r>
       <w:r>
         <w:rPr>
@@ -2224,27 +1513,7 @@
           <w:szCs w:val="24"/>
           <w:lang w:val="en-US"/>
         </w:rPr>
-        <w:t xml:space="preserve">), </w:t>
-      </w:r>
-      <w:proofErr w:type="spellStart"/>
-      <w:r>
-        <w:rPr>
-          <w:rFonts w:ascii="Times New Roman" w:eastAsia="Calibri" w:hAnsi="Times New Roman" w:cs="Times New Roman"/>
-          <w:sz w:val="24"/>
-          <w:szCs w:val="24"/>
-          <w:lang w:val="en-US"/>
-        </w:rPr>
-        <w:t>efek</w:t>
-      </w:r>
-      <w:proofErr w:type="spellEnd"/>
-      <w:r>
-        <w:rPr>
-          <w:rFonts w:ascii="Times New Roman" w:eastAsia="Calibri" w:hAnsi="Times New Roman" w:cs="Times New Roman"/>
-          <w:sz w:val="24"/>
-          <w:szCs w:val="24"/>
-          <w:lang w:val="en-US"/>
-        </w:rPr>
-        <w:t xml:space="preserve"> </w:t>
+        <w:t xml:space="preserve"> dan </w:t>
       </w:r>
       <w:r>
         <w:rPr>
@@ -2255,7 +1524,7 @@
           <w:szCs w:val="24"/>
           <w:lang w:val="en-US"/>
         </w:rPr>
-        <w:t>scroll reveal</w:t>
+        <w:t>viewport meta tag</w:t>
       </w:r>
       <w:r>
         <w:rPr>
@@ -2264,47 +1533,7 @@
           <w:szCs w:val="24"/>
           <w:lang w:val="en-US"/>
         </w:rPr>
-        <w:t xml:space="preserve">, dan </w:t>
-      </w:r>
-      <w:proofErr w:type="spellStart"/>
-      <w:r>
-        <w:rPr>
-          <w:rFonts w:ascii="Times New Roman" w:eastAsia="Calibri" w:hAnsi="Times New Roman" w:cs="Times New Roman"/>
-          <w:sz w:val="24"/>
-          <w:szCs w:val="24"/>
-          <w:lang w:val="en-US"/>
-        </w:rPr>
-        <w:t>tombol</w:t>
-      </w:r>
-      <w:proofErr w:type="spellEnd"/>
-      <w:r>
-        <w:rPr>
-          <w:rFonts w:ascii="Times New Roman" w:eastAsia="Calibri" w:hAnsi="Times New Roman" w:cs="Times New Roman"/>
-          <w:sz w:val="24"/>
-          <w:szCs w:val="24"/>
-          <w:lang w:val="en-US"/>
-        </w:rPr>
-        <w:t xml:space="preserve"> </w:t>
-      </w:r>
-      <w:r>
-        <w:rPr>
-          <w:rFonts w:ascii="Times New Roman" w:eastAsia="Calibri" w:hAnsi="Times New Roman" w:cs="Times New Roman"/>
-          <w:i/>
-          <w:iCs/>
-          <w:sz w:val="24"/>
-          <w:szCs w:val="24"/>
-          <w:lang w:val="en-US"/>
-        </w:rPr>
-        <w:t>back-to-top</w:t>
-      </w:r>
-      <w:r>
-        <w:rPr>
-          <w:rFonts w:ascii="Times New Roman" w:eastAsia="Calibri" w:hAnsi="Times New Roman" w:cs="Times New Roman"/>
-          <w:sz w:val="24"/>
-          <w:szCs w:val="24"/>
-          <w:lang w:val="en-US"/>
-        </w:rPr>
-        <w:t xml:space="preserve">. </w:t>
+        <w:t xml:space="preserve"> agar rapi di semua ukuran layar. </w:t>
       </w:r>
     </w:p>
     <w:p>
@@ -2328,47 +1557,7 @@
           <w:szCs w:val="24"/>
           <w:lang w:val="en-US"/>
         </w:rPr>
-        <w:t xml:space="preserve">Responsive Design: </w:t>
-      </w:r>
-      <w:proofErr w:type="spellStart"/>
-      <w:r>
-        <w:rPr>
-          <w:rFonts w:ascii="Times New Roman" w:eastAsia="Calibri" w:hAnsi="Times New Roman" w:cs="Times New Roman"/>
-          <w:sz w:val="24"/>
-          <w:szCs w:val="24"/>
-          <w:lang w:val="en-US"/>
-        </w:rPr>
-        <w:t>Menerapkan</w:t>
-      </w:r>
-      <w:proofErr w:type="spellEnd"/>
-      <w:r>
-        <w:rPr>
-          <w:rFonts w:ascii="Times New Roman" w:eastAsia="Calibri" w:hAnsi="Times New Roman" w:cs="Times New Roman"/>
-          <w:sz w:val="24"/>
-          <w:szCs w:val="24"/>
-          <w:lang w:val="en-US"/>
-        </w:rPr>
-        <w:t xml:space="preserve"> </w:t>
-      </w:r>
-      <w:proofErr w:type="spellStart"/>
-      <w:r>
-        <w:rPr>
-          <w:rFonts w:ascii="Times New Roman" w:eastAsia="Calibri" w:hAnsi="Times New Roman" w:cs="Times New Roman"/>
-          <w:sz w:val="24"/>
-          <w:szCs w:val="24"/>
-          <w:lang w:val="en-US"/>
-        </w:rPr>
-        <w:t>pendekatan</w:t>
-      </w:r>
-      <w:proofErr w:type="spellEnd"/>
-      <w:r>
-        <w:rPr>
-          <w:rFonts w:ascii="Times New Roman" w:eastAsia="Calibri" w:hAnsi="Times New Roman" w:cs="Times New Roman"/>
-          <w:sz w:val="24"/>
-          <w:szCs w:val="24"/>
-          <w:lang w:val="en-US"/>
-        </w:rPr>
-        <w:t xml:space="preserve"> </w:t>
+        <w:t xml:space="preserve">Bootstrap Integration: Menggunakan </w:t>
       </w:r>
       <w:r>
         <w:rPr>
@@ -2379,7 +1568,7 @@
           <w:szCs w:val="24"/>
           <w:lang w:val="en-US"/>
         </w:rPr>
-        <w:t>mobile-first</w:t>
+        <w:t>grid system</w:t>
       </w:r>
       <w:r>
         <w:rPr>
@@ -2388,27 +1577,7 @@
           <w:szCs w:val="24"/>
           <w:lang w:val="en-US"/>
         </w:rPr>
-        <w:t xml:space="preserve"> </w:t>
-      </w:r>
-      <w:proofErr w:type="spellStart"/>
-      <w:r>
-        <w:rPr>
-          <w:rFonts w:ascii="Times New Roman" w:eastAsia="Calibri" w:hAnsi="Times New Roman" w:cs="Times New Roman"/>
-          <w:sz w:val="24"/>
-          <w:szCs w:val="24"/>
-          <w:lang w:val="en-US"/>
-        </w:rPr>
-        <w:t>menggunakan</w:t>
-      </w:r>
-      <w:proofErr w:type="spellEnd"/>
-      <w:r>
-        <w:rPr>
-          <w:rFonts w:ascii="Times New Roman" w:eastAsia="Calibri" w:hAnsi="Times New Roman" w:cs="Times New Roman"/>
-          <w:sz w:val="24"/>
-          <w:szCs w:val="24"/>
-          <w:lang w:val="en-US"/>
-        </w:rPr>
-        <w:t xml:space="preserve"> </w:t>
+        <w:t xml:space="preserve"> 12-kolom, komponen (</w:t>
       </w:r>
       <w:r>
         <w:rPr>
@@ -2419,7 +1588,7 @@
           <w:szCs w:val="24"/>
           <w:lang w:val="en-US"/>
         </w:rPr>
-        <w:t>media queries</w:t>
+        <w:t>buttons, badges, cards, navbar</w:t>
       </w:r>
       <w:r>
         <w:rPr>
@@ -2428,7 +1597,7 @@
           <w:szCs w:val="24"/>
           <w:lang w:val="en-US"/>
         </w:rPr>
-        <w:t xml:space="preserve"> dan </w:t>
+        <w:t xml:space="preserve">), dan </w:t>
       </w:r>
       <w:r>
         <w:rPr>
@@ -2439,88 +1608,8 @@
           <w:szCs w:val="24"/>
           <w:lang w:val="en-US"/>
         </w:rPr>
-        <w:t>viewport meta tag</w:t>
-      </w:r>
-      <w:r>
-        <w:rPr>
-          <w:rFonts w:ascii="Times New Roman" w:eastAsia="Calibri" w:hAnsi="Times New Roman" w:cs="Times New Roman"/>
-          <w:sz w:val="24"/>
-          <w:szCs w:val="24"/>
-          <w:lang w:val="en-US"/>
-        </w:rPr>
-        <w:t xml:space="preserve"> agar </w:t>
-      </w:r>
-      <w:proofErr w:type="spellStart"/>
-      <w:r>
-        <w:rPr>
-          <w:rFonts w:ascii="Times New Roman" w:eastAsia="Calibri" w:hAnsi="Times New Roman" w:cs="Times New Roman"/>
-          <w:sz w:val="24"/>
-          <w:szCs w:val="24"/>
-          <w:lang w:val="en-US"/>
-        </w:rPr>
-        <w:t>rapi</w:t>
-      </w:r>
-      <w:proofErr w:type="spellEnd"/>
-      <w:r>
-        <w:rPr>
-          <w:rFonts w:ascii="Times New Roman" w:eastAsia="Calibri" w:hAnsi="Times New Roman" w:cs="Times New Roman"/>
-          <w:sz w:val="24"/>
-          <w:szCs w:val="24"/>
-          <w:lang w:val="en-US"/>
-        </w:rPr>
-        <w:t xml:space="preserve"> di </w:t>
-      </w:r>
-      <w:proofErr w:type="spellStart"/>
-      <w:r>
-        <w:rPr>
-          <w:rFonts w:ascii="Times New Roman" w:eastAsia="Calibri" w:hAnsi="Times New Roman" w:cs="Times New Roman"/>
-          <w:sz w:val="24"/>
-          <w:szCs w:val="24"/>
-          <w:lang w:val="en-US"/>
-        </w:rPr>
-        <w:t>semua</w:t>
-      </w:r>
-      <w:proofErr w:type="spellEnd"/>
-      <w:r>
-        <w:rPr>
-          <w:rFonts w:ascii="Times New Roman" w:eastAsia="Calibri" w:hAnsi="Times New Roman" w:cs="Times New Roman"/>
-          <w:sz w:val="24"/>
-          <w:szCs w:val="24"/>
-          <w:lang w:val="en-US"/>
-        </w:rPr>
-        <w:t xml:space="preserve"> </w:t>
-      </w:r>
-      <w:proofErr w:type="spellStart"/>
-      <w:r>
-        <w:rPr>
-          <w:rFonts w:ascii="Times New Roman" w:eastAsia="Calibri" w:hAnsi="Times New Roman" w:cs="Times New Roman"/>
-          <w:sz w:val="24"/>
-          <w:szCs w:val="24"/>
-          <w:lang w:val="en-US"/>
-        </w:rPr>
-        <w:t>ukuran</w:t>
-      </w:r>
-      <w:proofErr w:type="spellEnd"/>
-      <w:r>
-        <w:rPr>
-          <w:rFonts w:ascii="Times New Roman" w:eastAsia="Calibri" w:hAnsi="Times New Roman" w:cs="Times New Roman"/>
-          <w:sz w:val="24"/>
-          <w:szCs w:val="24"/>
-          <w:lang w:val="en-US"/>
-        </w:rPr>
-        <w:t xml:space="preserve"> </w:t>
-      </w:r>
-      <w:proofErr w:type="spellStart"/>
-      <w:r>
-        <w:rPr>
-          <w:rFonts w:ascii="Times New Roman" w:eastAsia="Calibri" w:hAnsi="Times New Roman" w:cs="Times New Roman"/>
-          <w:sz w:val="24"/>
-          <w:szCs w:val="24"/>
-          <w:lang w:val="en-US"/>
-        </w:rPr>
-        <w:t>layar</w:t>
-      </w:r>
-      <w:proofErr w:type="spellEnd"/>
+        <w:t>Bootstrap Icons</w:t>
+      </w:r>
       <w:r>
         <w:rPr>
           <w:rFonts w:ascii="Times New Roman" w:eastAsia="Calibri" w:hAnsi="Times New Roman" w:cs="Times New Roman"/>
@@ -2552,27 +1641,7 @@
           <w:szCs w:val="24"/>
           <w:lang w:val="en-US"/>
         </w:rPr>
-        <w:t xml:space="preserve">Bootstrap Integration: </w:t>
-      </w:r>
-      <w:proofErr w:type="spellStart"/>
-      <w:r>
-        <w:rPr>
-          <w:rFonts w:ascii="Times New Roman" w:eastAsia="Calibri" w:hAnsi="Times New Roman" w:cs="Times New Roman"/>
-          <w:sz w:val="24"/>
-          <w:szCs w:val="24"/>
-          <w:lang w:val="en-US"/>
-        </w:rPr>
-        <w:t>Menggunakan</w:t>
-      </w:r>
-      <w:proofErr w:type="spellEnd"/>
-      <w:r>
-        <w:rPr>
-          <w:rFonts w:ascii="Times New Roman" w:eastAsia="Calibri" w:hAnsi="Times New Roman" w:cs="Times New Roman"/>
-          <w:sz w:val="24"/>
-          <w:szCs w:val="24"/>
-          <w:lang w:val="en-US"/>
-        </w:rPr>
-        <w:t xml:space="preserve"> </w:t>
+        <w:t xml:space="preserve">Animasi &amp; Transisi: Efek </w:t>
       </w:r>
       <w:r>
         <w:rPr>
@@ -2583,28 +1652,8 @@
           <w:szCs w:val="24"/>
           <w:lang w:val="en-US"/>
         </w:rPr>
-        <w:t>grid system</w:t>
-      </w:r>
-      <w:r>
-        <w:rPr>
-          <w:rFonts w:ascii="Times New Roman" w:eastAsia="Calibri" w:hAnsi="Times New Roman" w:cs="Times New Roman"/>
-          <w:sz w:val="24"/>
-          <w:szCs w:val="24"/>
-          <w:lang w:val="en-US"/>
-        </w:rPr>
-        <w:t xml:space="preserve"> 12-kolom, </w:t>
-      </w:r>
-      <w:proofErr w:type="spellStart"/>
-      <w:r>
-        <w:rPr>
-          <w:rFonts w:ascii="Times New Roman" w:eastAsia="Calibri" w:hAnsi="Times New Roman" w:cs="Times New Roman"/>
-          <w:sz w:val="24"/>
-          <w:szCs w:val="24"/>
-          <w:lang w:val="en-US"/>
-        </w:rPr>
-        <w:t>komponen</w:t>
-      </w:r>
-      <w:proofErr w:type="spellEnd"/>
+        <w:t>running text</w:t>
+      </w:r>
       <w:r>
         <w:rPr>
           <w:rFonts w:ascii="Times New Roman" w:eastAsia="Calibri" w:hAnsi="Times New Roman" w:cs="Times New Roman"/>
@@ -2623,7 +1672,7 @@
           <w:szCs w:val="24"/>
           <w:lang w:val="en-US"/>
         </w:rPr>
-        <w:t>buttons, badges, cards, navbar</w:t>
+        <w:t>marquee</w:t>
       </w:r>
       <w:r>
         <w:rPr>
@@ -2632,7 +1681,7 @@
           <w:szCs w:val="24"/>
           <w:lang w:val="en-US"/>
         </w:rPr>
-        <w:t xml:space="preserve">), dan </w:t>
+        <w:t xml:space="preserve">) memakai @keyframes, transisi </w:t>
       </w:r>
       <w:r>
         <w:rPr>
@@ -2643,7 +1692,7 @@
           <w:szCs w:val="24"/>
           <w:lang w:val="en-US"/>
         </w:rPr>
-        <w:t>Bootstrap Icons</w:t>
+        <w:t>hover</w:t>
       </w:r>
       <w:r>
         <w:rPr>
@@ -2652,7 +1701,7 @@
           <w:szCs w:val="24"/>
           <w:lang w:val="en-US"/>
         </w:rPr>
-        <w:t xml:space="preserve">. </w:t>
+        <w:t xml:space="preserve"> pada kartu/tombol, dan transformasi elemen. </w:t>
       </w:r>
     </w:p>
     <w:p>
@@ -2669,7 +1718,6 @@
           <w:lang w:val="en-US"/>
         </w:rPr>
       </w:pPr>
-      <w:proofErr w:type="spellStart"/>
       <w:r>
         <w:rPr>
           <w:rFonts w:ascii="Times New Roman" w:eastAsia="Calibri" w:hAnsi="Times New Roman" w:cs="Times New Roman"/>
@@ -2677,57 +1725,7 @@
           <w:szCs w:val="24"/>
           <w:lang w:val="en-US"/>
         </w:rPr>
-        <w:t>Animasi</w:t>
-      </w:r>
-      <w:proofErr w:type="spellEnd"/>
-      <w:r>
-        <w:rPr>
-          <w:rFonts w:ascii="Times New Roman" w:eastAsia="Calibri" w:hAnsi="Times New Roman" w:cs="Times New Roman"/>
-          <w:sz w:val="24"/>
-          <w:szCs w:val="24"/>
-          <w:lang w:val="en-US"/>
-        </w:rPr>
-        <w:t xml:space="preserve"> &amp; </w:t>
-      </w:r>
-      <w:proofErr w:type="spellStart"/>
-      <w:r>
-        <w:rPr>
-          <w:rFonts w:ascii="Times New Roman" w:eastAsia="Calibri" w:hAnsi="Times New Roman" w:cs="Times New Roman"/>
-          <w:sz w:val="24"/>
-          <w:szCs w:val="24"/>
-          <w:lang w:val="en-US"/>
-        </w:rPr>
-        <w:t>Transisi</w:t>
-      </w:r>
-      <w:proofErr w:type="spellEnd"/>
-      <w:r>
-        <w:rPr>
-          <w:rFonts w:ascii="Times New Roman" w:eastAsia="Calibri" w:hAnsi="Times New Roman" w:cs="Times New Roman"/>
-          <w:sz w:val="24"/>
-          <w:szCs w:val="24"/>
-          <w:lang w:val="en-US"/>
-        </w:rPr>
-        <w:t xml:space="preserve">: </w:t>
-      </w:r>
-      <w:proofErr w:type="spellStart"/>
-      <w:r>
-        <w:rPr>
-          <w:rFonts w:ascii="Times New Roman" w:eastAsia="Calibri" w:hAnsi="Times New Roman" w:cs="Times New Roman"/>
-          <w:sz w:val="24"/>
-          <w:szCs w:val="24"/>
-          <w:lang w:val="en-US"/>
-        </w:rPr>
-        <w:t>Efek</w:t>
-      </w:r>
-      <w:proofErr w:type="spellEnd"/>
-      <w:r>
-        <w:rPr>
-          <w:rFonts w:ascii="Times New Roman" w:eastAsia="Calibri" w:hAnsi="Times New Roman" w:cs="Times New Roman"/>
-          <w:sz w:val="24"/>
-          <w:szCs w:val="24"/>
-          <w:lang w:val="en-US"/>
-        </w:rPr>
-        <w:t xml:space="preserve"> </w:t>
+        <w:t xml:space="preserve">Best Practices: Penataan struktur folder rapi, penamaan BEM, optimasi gambar, </w:t>
       </w:r>
       <w:r>
         <w:rPr>
@@ -2738,7 +1736,7 @@
           <w:szCs w:val="24"/>
           <w:lang w:val="en-US"/>
         </w:rPr>
-        <w:t>running text</w:t>
+        <w:t>fallback styling</w:t>
       </w:r>
       <w:r>
         <w:rPr>
@@ -2747,382 +1745,7 @@
           <w:szCs w:val="24"/>
           <w:lang w:val="en-US"/>
         </w:rPr>
-        <w:t xml:space="preserve"> (</w:t>
-      </w:r>
-      <w:r>
-        <w:rPr>
-          <w:rFonts w:ascii="Times New Roman" w:eastAsia="Calibri" w:hAnsi="Times New Roman" w:cs="Times New Roman"/>
-          <w:i/>
-          <w:iCs/>
-          <w:sz w:val="24"/>
-          <w:szCs w:val="24"/>
-          <w:lang w:val="en-US"/>
-        </w:rPr>
-        <w:t>marquee</w:t>
-      </w:r>
-      <w:r>
-        <w:rPr>
-          <w:rFonts w:ascii="Times New Roman" w:eastAsia="Calibri" w:hAnsi="Times New Roman" w:cs="Times New Roman"/>
-          <w:sz w:val="24"/>
-          <w:szCs w:val="24"/>
-          <w:lang w:val="en-US"/>
-        </w:rPr>
-        <w:t xml:space="preserve">) </w:t>
-      </w:r>
-      <w:proofErr w:type="spellStart"/>
-      <w:proofErr w:type="gramStart"/>
-      <w:r>
-        <w:rPr>
-          <w:rFonts w:ascii="Times New Roman" w:eastAsia="Calibri" w:hAnsi="Times New Roman" w:cs="Times New Roman"/>
-          <w:sz w:val="24"/>
-          <w:szCs w:val="24"/>
-          <w:lang w:val="en-US"/>
-        </w:rPr>
-        <w:t>memakai</w:t>
-      </w:r>
-      <w:proofErr w:type="spellEnd"/>
-      <w:r>
-        <w:rPr>
-          <w:rFonts w:ascii="Times New Roman" w:eastAsia="Calibri" w:hAnsi="Times New Roman" w:cs="Times New Roman"/>
-          <w:sz w:val="24"/>
-          <w:szCs w:val="24"/>
-          <w:lang w:val="en-US"/>
-        </w:rPr>
-        <w:t xml:space="preserve"> @</w:t>
-      </w:r>
-      <w:proofErr w:type="gramEnd"/>
-      <w:r>
-        <w:rPr>
-          <w:rFonts w:ascii="Times New Roman" w:eastAsia="Calibri" w:hAnsi="Times New Roman" w:cs="Times New Roman"/>
-          <w:sz w:val="24"/>
-          <w:szCs w:val="24"/>
-          <w:lang w:val="en-US"/>
-        </w:rPr>
-        <w:t xml:space="preserve">keyframes, </w:t>
-      </w:r>
-      <w:proofErr w:type="spellStart"/>
-      <w:r>
-        <w:rPr>
-          <w:rFonts w:ascii="Times New Roman" w:eastAsia="Calibri" w:hAnsi="Times New Roman" w:cs="Times New Roman"/>
-          <w:sz w:val="24"/>
-          <w:szCs w:val="24"/>
-          <w:lang w:val="en-US"/>
-        </w:rPr>
-        <w:t>transisi</w:t>
-      </w:r>
-      <w:proofErr w:type="spellEnd"/>
-      <w:r>
-        <w:rPr>
-          <w:rFonts w:ascii="Times New Roman" w:eastAsia="Calibri" w:hAnsi="Times New Roman" w:cs="Times New Roman"/>
-          <w:sz w:val="24"/>
-          <w:szCs w:val="24"/>
-          <w:lang w:val="en-US"/>
-        </w:rPr>
-        <w:t xml:space="preserve"> </w:t>
-      </w:r>
-      <w:r>
-        <w:rPr>
-          <w:rFonts w:ascii="Times New Roman" w:eastAsia="Calibri" w:hAnsi="Times New Roman" w:cs="Times New Roman"/>
-          <w:i/>
-          <w:iCs/>
-          <w:sz w:val="24"/>
-          <w:szCs w:val="24"/>
-          <w:lang w:val="en-US"/>
-        </w:rPr>
-        <w:t>hover</w:t>
-      </w:r>
-      <w:r>
-        <w:rPr>
-          <w:rFonts w:ascii="Times New Roman" w:eastAsia="Calibri" w:hAnsi="Times New Roman" w:cs="Times New Roman"/>
-          <w:sz w:val="24"/>
-          <w:szCs w:val="24"/>
-          <w:lang w:val="en-US"/>
-        </w:rPr>
-        <w:t xml:space="preserve"> pada </w:t>
-      </w:r>
-      <w:proofErr w:type="spellStart"/>
-      <w:r>
-        <w:rPr>
-          <w:rFonts w:ascii="Times New Roman" w:eastAsia="Calibri" w:hAnsi="Times New Roman" w:cs="Times New Roman"/>
-          <w:sz w:val="24"/>
-          <w:szCs w:val="24"/>
-          <w:lang w:val="en-US"/>
-        </w:rPr>
-        <w:t>kartu</w:t>
-      </w:r>
-      <w:proofErr w:type="spellEnd"/>
-      <w:r>
-        <w:rPr>
-          <w:rFonts w:ascii="Times New Roman" w:eastAsia="Calibri" w:hAnsi="Times New Roman" w:cs="Times New Roman"/>
-          <w:sz w:val="24"/>
-          <w:szCs w:val="24"/>
-          <w:lang w:val="en-US"/>
-        </w:rPr>
-        <w:t>/</w:t>
-      </w:r>
-      <w:proofErr w:type="spellStart"/>
-      <w:r>
-        <w:rPr>
-          <w:rFonts w:ascii="Times New Roman" w:eastAsia="Calibri" w:hAnsi="Times New Roman" w:cs="Times New Roman"/>
-          <w:sz w:val="24"/>
-          <w:szCs w:val="24"/>
-          <w:lang w:val="en-US"/>
-        </w:rPr>
-        <w:t>tombol</w:t>
-      </w:r>
-      <w:proofErr w:type="spellEnd"/>
-      <w:r>
-        <w:rPr>
-          <w:rFonts w:ascii="Times New Roman" w:eastAsia="Calibri" w:hAnsi="Times New Roman" w:cs="Times New Roman"/>
-          <w:sz w:val="24"/>
-          <w:szCs w:val="24"/>
-          <w:lang w:val="en-US"/>
-        </w:rPr>
-        <w:t xml:space="preserve">, dan </w:t>
-      </w:r>
-      <w:proofErr w:type="spellStart"/>
-      <w:r>
-        <w:rPr>
-          <w:rFonts w:ascii="Times New Roman" w:eastAsia="Calibri" w:hAnsi="Times New Roman" w:cs="Times New Roman"/>
-          <w:sz w:val="24"/>
-          <w:szCs w:val="24"/>
-          <w:lang w:val="en-US"/>
-        </w:rPr>
-        <w:t>transformasi</w:t>
-      </w:r>
-      <w:proofErr w:type="spellEnd"/>
-      <w:r>
-        <w:rPr>
-          <w:rFonts w:ascii="Times New Roman" w:eastAsia="Calibri" w:hAnsi="Times New Roman" w:cs="Times New Roman"/>
-          <w:sz w:val="24"/>
-          <w:szCs w:val="24"/>
-          <w:lang w:val="en-US"/>
-        </w:rPr>
-        <w:t xml:space="preserve"> </w:t>
-      </w:r>
-      <w:proofErr w:type="spellStart"/>
-      <w:r>
-        <w:rPr>
-          <w:rFonts w:ascii="Times New Roman" w:eastAsia="Calibri" w:hAnsi="Times New Roman" w:cs="Times New Roman"/>
-          <w:sz w:val="24"/>
-          <w:szCs w:val="24"/>
-          <w:lang w:val="en-US"/>
-        </w:rPr>
-        <w:t>elemen</w:t>
-      </w:r>
-      <w:proofErr w:type="spellEnd"/>
-      <w:r>
-        <w:rPr>
-          <w:rFonts w:ascii="Times New Roman" w:eastAsia="Calibri" w:hAnsi="Times New Roman" w:cs="Times New Roman"/>
-          <w:sz w:val="24"/>
-          <w:szCs w:val="24"/>
-          <w:lang w:val="en-US"/>
-        </w:rPr>
-        <w:t xml:space="preserve">. </w:t>
-      </w:r>
-    </w:p>
-    <w:p>
-      <w:pPr>
-        <w:numPr>
-          <w:ilvl w:val="0"/>
-          <w:numId w:val="5"/>
-        </w:numPr>
-        <w:spacing w:before="400" w:after="200"/>
-        <w:rPr>
-          <w:rFonts w:ascii="Times New Roman" w:eastAsia="Calibri" w:hAnsi="Times New Roman" w:cs="Times New Roman"/>
-          <w:sz w:val="24"/>
-          <w:szCs w:val="24"/>
-          <w:lang w:val="en-US"/>
-        </w:rPr>
-      </w:pPr>
-      <w:r>
-        <w:rPr>
-          <w:rFonts w:ascii="Times New Roman" w:eastAsia="Calibri" w:hAnsi="Times New Roman" w:cs="Times New Roman"/>
-          <w:sz w:val="24"/>
-          <w:szCs w:val="24"/>
-          <w:lang w:val="en-US"/>
-        </w:rPr>
-        <w:t xml:space="preserve">Best Practices: </w:t>
-      </w:r>
-      <w:proofErr w:type="spellStart"/>
-      <w:r>
-        <w:rPr>
-          <w:rFonts w:ascii="Times New Roman" w:eastAsia="Calibri" w:hAnsi="Times New Roman" w:cs="Times New Roman"/>
-          <w:sz w:val="24"/>
-          <w:szCs w:val="24"/>
-          <w:lang w:val="en-US"/>
-        </w:rPr>
-        <w:t>Penataan</w:t>
-      </w:r>
-      <w:proofErr w:type="spellEnd"/>
-      <w:r>
-        <w:rPr>
-          <w:rFonts w:ascii="Times New Roman" w:eastAsia="Calibri" w:hAnsi="Times New Roman" w:cs="Times New Roman"/>
-          <w:sz w:val="24"/>
-          <w:szCs w:val="24"/>
-          <w:lang w:val="en-US"/>
-        </w:rPr>
-        <w:t xml:space="preserve"> </w:t>
-      </w:r>
-      <w:proofErr w:type="spellStart"/>
-      <w:r>
-        <w:rPr>
-          <w:rFonts w:ascii="Times New Roman" w:eastAsia="Calibri" w:hAnsi="Times New Roman" w:cs="Times New Roman"/>
-          <w:sz w:val="24"/>
-          <w:szCs w:val="24"/>
-          <w:lang w:val="en-US"/>
-        </w:rPr>
-        <w:t>struktur</w:t>
-      </w:r>
-      <w:proofErr w:type="spellEnd"/>
-      <w:r>
-        <w:rPr>
-          <w:rFonts w:ascii="Times New Roman" w:eastAsia="Calibri" w:hAnsi="Times New Roman" w:cs="Times New Roman"/>
-          <w:sz w:val="24"/>
-          <w:szCs w:val="24"/>
-          <w:lang w:val="en-US"/>
-        </w:rPr>
-        <w:t xml:space="preserve"> folder </w:t>
-      </w:r>
-      <w:proofErr w:type="spellStart"/>
-      <w:r>
-        <w:rPr>
-          <w:rFonts w:ascii="Times New Roman" w:eastAsia="Calibri" w:hAnsi="Times New Roman" w:cs="Times New Roman"/>
-          <w:sz w:val="24"/>
-          <w:szCs w:val="24"/>
-          <w:lang w:val="en-US"/>
-        </w:rPr>
-        <w:t>rapi</w:t>
-      </w:r>
-      <w:proofErr w:type="spellEnd"/>
-      <w:r>
-        <w:rPr>
-          <w:rFonts w:ascii="Times New Roman" w:eastAsia="Calibri" w:hAnsi="Times New Roman" w:cs="Times New Roman"/>
-          <w:sz w:val="24"/>
-          <w:szCs w:val="24"/>
-          <w:lang w:val="en-US"/>
-        </w:rPr>
-        <w:t xml:space="preserve">, </w:t>
-      </w:r>
-      <w:proofErr w:type="spellStart"/>
-      <w:r>
-        <w:rPr>
-          <w:rFonts w:ascii="Times New Roman" w:eastAsia="Calibri" w:hAnsi="Times New Roman" w:cs="Times New Roman"/>
-          <w:sz w:val="24"/>
-          <w:szCs w:val="24"/>
-          <w:lang w:val="en-US"/>
-        </w:rPr>
-        <w:t>penamaan</w:t>
-      </w:r>
-      <w:proofErr w:type="spellEnd"/>
-      <w:r>
-        <w:rPr>
-          <w:rFonts w:ascii="Times New Roman" w:eastAsia="Calibri" w:hAnsi="Times New Roman" w:cs="Times New Roman"/>
-          <w:sz w:val="24"/>
-          <w:szCs w:val="24"/>
-          <w:lang w:val="en-US"/>
-        </w:rPr>
-        <w:t xml:space="preserve"> BEM, </w:t>
-      </w:r>
-      <w:proofErr w:type="spellStart"/>
-      <w:r>
-        <w:rPr>
-          <w:rFonts w:ascii="Times New Roman" w:eastAsia="Calibri" w:hAnsi="Times New Roman" w:cs="Times New Roman"/>
-          <w:sz w:val="24"/>
-          <w:szCs w:val="24"/>
-          <w:lang w:val="en-US"/>
-        </w:rPr>
-        <w:t>optimasi</w:t>
-      </w:r>
-      <w:proofErr w:type="spellEnd"/>
-      <w:r>
-        <w:rPr>
-          <w:rFonts w:ascii="Times New Roman" w:eastAsia="Calibri" w:hAnsi="Times New Roman" w:cs="Times New Roman"/>
-          <w:sz w:val="24"/>
-          <w:szCs w:val="24"/>
-          <w:lang w:val="en-US"/>
-        </w:rPr>
-        <w:t xml:space="preserve"> </w:t>
-      </w:r>
-      <w:proofErr w:type="spellStart"/>
-      <w:r>
-        <w:rPr>
-          <w:rFonts w:ascii="Times New Roman" w:eastAsia="Calibri" w:hAnsi="Times New Roman" w:cs="Times New Roman"/>
-          <w:sz w:val="24"/>
-          <w:szCs w:val="24"/>
-          <w:lang w:val="en-US"/>
-        </w:rPr>
-        <w:t>gambar</w:t>
-      </w:r>
-      <w:proofErr w:type="spellEnd"/>
-      <w:r>
-        <w:rPr>
-          <w:rFonts w:ascii="Times New Roman" w:eastAsia="Calibri" w:hAnsi="Times New Roman" w:cs="Times New Roman"/>
-          <w:sz w:val="24"/>
-          <w:szCs w:val="24"/>
-          <w:lang w:val="en-US"/>
-        </w:rPr>
-        <w:t xml:space="preserve">, </w:t>
-      </w:r>
-      <w:r>
-        <w:rPr>
-          <w:rFonts w:ascii="Times New Roman" w:eastAsia="Calibri" w:hAnsi="Times New Roman" w:cs="Times New Roman"/>
-          <w:i/>
-          <w:iCs/>
-          <w:sz w:val="24"/>
-          <w:szCs w:val="24"/>
-          <w:lang w:val="en-US"/>
-        </w:rPr>
-        <w:t>fallback styling</w:t>
-      </w:r>
-      <w:r>
-        <w:rPr>
-          <w:rFonts w:ascii="Times New Roman" w:eastAsia="Calibri" w:hAnsi="Times New Roman" w:cs="Times New Roman"/>
-          <w:sz w:val="24"/>
-          <w:szCs w:val="24"/>
-          <w:lang w:val="en-US"/>
-        </w:rPr>
-        <w:t xml:space="preserve">, dan </w:t>
-      </w:r>
-      <w:proofErr w:type="spellStart"/>
-      <w:r>
-        <w:rPr>
-          <w:rFonts w:ascii="Times New Roman" w:eastAsia="Calibri" w:hAnsi="Times New Roman" w:cs="Times New Roman"/>
-          <w:sz w:val="24"/>
-          <w:szCs w:val="24"/>
-          <w:lang w:val="en-US"/>
-        </w:rPr>
-        <w:t>pemenuhan</w:t>
-      </w:r>
-      <w:proofErr w:type="spellEnd"/>
-      <w:r>
-        <w:rPr>
-          <w:rFonts w:ascii="Times New Roman" w:eastAsia="Calibri" w:hAnsi="Times New Roman" w:cs="Times New Roman"/>
-          <w:sz w:val="24"/>
-          <w:szCs w:val="24"/>
-          <w:lang w:val="en-US"/>
-        </w:rPr>
-        <w:t xml:space="preserve"> </w:t>
-      </w:r>
-      <w:proofErr w:type="spellStart"/>
-      <w:r>
-        <w:rPr>
-          <w:rFonts w:ascii="Times New Roman" w:eastAsia="Calibri" w:hAnsi="Times New Roman" w:cs="Times New Roman"/>
-          <w:sz w:val="24"/>
-          <w:szCs w:val="24"/>
-          <w:lang w:val="en-US"/>
-        </w:rPr>
-        <w:t>standar</w:t>
-      </w:r>
-      <w:proofErr w:type="spellEnd"/>
-      <w:r>
-        <w:rPr>
-          <w:rFonts w:ascii="Times New Roman" w:eastAsia="Calibri" w:hAnsi="Times New Roman" w:cs="Times New Roman"/>
-          <w:sz w:val="24"/>
-          <w:szCs w:val="24"/>
-          <w:lang w:val="en-US"/>
-        </w:rPr>
-        <w:t xml:space="preserve"> W3C. </w:t>
+        <w:t xml:space="preserve">, dan pemenuhan standar W3C. </w:t>
       </w:r>
     </w:p>
     <w:p>
@@ -3182,33 +1805,15 @@
           <w:sz w:val="24"/>
           <w:szCs w:val="24"/>
         </w:rPr>
-        <w:t xml:space="preserve">Link clone </w:t>
-      </w:r>
-      <w:proofErr w:type="gramStart"/>
+        <w:t>Link clone GitHub</w:t>
+      </w:r>
       <w:r>
         <w:rPr>
           <w:rFonts w:ascii="Times New Roman" w:hAnsi="Times New Roman" w:cs="Times New Roman"/>
           <w:sz w:val="24"/>
           <w:szCs w:val="24"/>
         </w:rPr>
-        <w:t>GitHub</w:t>
-      </w:r>
-      <w:r>
-        <w:rPr>
-          <w:rFonts w:ascii="Times New Roman" w:hAnsi="Times New Roman" w:cs="Times New Roman"/>
-          <w:sz w:val="24"/>
-          <w:szCs w:val="24"/>
-        </w:rPr>
-        <w:t xml:space="preserve"> :</w:t>
-      </w:r>
-      <w:proofErr w:type="gramEnd"/>
-      <w:r>
-        <w:rPr>
-          <w:rFonts w:ascii="Times New Roman" w:hAnsi="Times New Roman" w:cs="Times New Roman"/>
-          <w:sz w:val="24"/>
-          <w:szCs w:val="24"/>
-        </w:rPr>
-        <w:t xml:space="preserve"> </w:t>
+        <w:t xml:space="preserve"> : </w:t>
       </w:r>
       <w:hyperlink r:id="rId12" w:history="1">
         <w:r>

</xml_diff>